<commit_message>
Update One-Way ANOVA student and teacher documents; remove temporary files and add new student document
</commit_message>
<xml_diff>
--- a/classroom_activities/anova_part_a_student_08.docx
+++ b/classroom_activities/anova_part_a_student_08.docx
@@ -456,39 +456,20 @@
         <w:spacing w:before="200" w:after="200"/>
         <w:rPr>
           <w:rFonts w:ascii="Garamond" w:hAnsi="Garamond"/>
-          <w:color w:val="000000" w:themeColor="text1"/>
-        </w:rPr>
-      </w:pPr>
-    </w:p>
-    <w:p>
-      <w:pPr>
-        <w:spacing w:before="200" w:after="200"/>
-        <w:rPr>
-          <w:rFonts w:ascii="Garamond" w:hAnsi="Garamond"/>
-          <w:color w:val="000000" w:themeColor="text1"/>
-        </w:rPr>
-      </w:pPr>
-    </w:p>
-    <w:p>
-      <w:pPr>
-        <w:spacing w:before="200" w:after="200"/>
-        <w:rPr>
-          <w:rFonts w:ascii="Garamond" w:hAnsi="Garamond"/>
-          <w:color w:val="000000" w:themeColor="text1"/>
-        </w:rPr>
-      </w:pPr>
-    </w:p>
-    <w:p>
-      <w:pPr>
-        <w:pBdr>
-          <w:bottom w:val="single" w:sz="4" w:space="0" w:color="DDD8CC"/>
-        </w:pBdr>
-        <w:spacing w:before="200" w:after="200"/>
-        <w:rPr>
-          <w:rFonts w:ascii="Garamond" w:hAnsi="Garamond"/>
-          <w:color w:val="000000" w:themeColor="text1"/>
-        </w:rPr>
-      </w:pPr>
+          <w:b/>
+          <w:bCs/>
+          <w:color w:val="FF0000"/>
+        </w:rPr>
+      </w:pPr>
+      <w:r>
+        <w:rPr>
+          <w:rFonts w:ascii="Garamond" w:hAnsi="Garamond"/>
+          <w:b/>
+          <w:bCs/>
+          <w:color w:val="FF0000"/>
+        </w:rPr>
+        <w:t>Is there a difference between the population mean exam score across all three methods (re-reading, active recall, or AI-Assisted) among students within an introductory stat class at Cal Poly?</w:t>
+      </w:r>
     </w:p>
     <w:p>
       <w:pPr>
@@ -567,15 +548,17 @@
               <w:spacing w:before="60" w:after="100"/>
               <w:rPr>
                 <w:rFonts w:ascii="Garamond" w:hAnsi="Garamond"/>
-                <w:color w:val="000000" w:themeColor="text1"/>
-              </w:rPr>
-            </w:pPr>
-            <w:r>
-              <w:rPr>
-                <w:rFonts w:ascii="Garamond" w:hAnsi="Garamond"/>
-                <w:b/>
-                <w:bCs/>
-                <w:color w:val="000000" w:themeColor="text1"/>
+                <w:b/>
+                <w:bCs/>
+                <w:color w:val="FF0000"/>
+              </w:rPr>
+            </w:pPr>
+            <w:r>
+              <w:rPr>
+                <w:rFonts w:ascii="Garamond" w:hAnsi="Garamond"/>
+                <w:b/>
+                <w:bCs/>
+                <w:color w:val="FF0000"/>
               </w:rPr>
               <w:t>Variable Name</w:t>
             </w:r>
@@ -590,15 +573,17 @@
               <w:spacing w:before="60" w:after="100"/>
               <w:rPr>
                 <w:rFonts w:ascii="Garamond" w:hAnsi="Garamond"/>
-                <w:color w:val="000000" w:themeColor="text1"/>
-              </w:rPr>
-            </w:pPr>
-            <w:r>
-              <w:rPr>
-                <w:rFonts w:ascii="Garamond" w:hAnsi="Garamond"/>
-                <w:b/>
-                <w:bCs/>
-                <w:color w:val="000000" w:themeColor="text1"/>
+                <w:b/>
+                <w:bCs/>
+                <w:color w:val="FF0000"/>
+              </w:rPr>
+            </w:pPr>
+            <w:r>
+              <w:rPr>
+                <w:rFonts w:ascii="Garamond" w:hAnsi="Garamond"/>
+                <w:b/>
+                <w:bCs/>
+                <w:color w:val="FF0000"/>
               </w:rPr>
               <w:t>Description</w:t>
             </w:r>
@@ -615,17 +600,31 @@
               <w:spacing w:before="60" w:after="100"/>
               <w:rPr>
                 <w:rFonts w:ascii="Garamond" w:hAnsi="Garamond"/>
-                <w:color w:val="000000" w:themeColor="text1"/>
+                <w:b/>
+                <w:bCs/>
+                <w:color w:val="FF0000"/>
                 <w:u w:val="single"/>
               </w:rPr>
             </w:pPr>
+            <w:r>
+              <w:rPr>
+                <w:rFonts w:ascii="Garamond" w:hAnsi="Garamond"/>
+                <w:b/>
+                <w:bCs/>
+                <w:color w:val="FF0000"/>
+                <w:u w:val="single"/>
+              </w:rPr>
+              <w:t>Study Method</w:t>
+            </w:r>
           </w:p>
           <w:p>
             <w:pPr>
               <w:spacing w:before="60" w:after="100"/>
               <w:rPr>
                 <w:rFonts w:ascii="Garamond" w:hAnsi="Garamond"/>
-                <w:color w:val="000000" w:themeColor="text1"/>
+                <w:b/>
+                <w:bCs/>
+                <w:color w:val="FF0000"/>
               </w:rPr>
             </w:pPr>
           </w:p>
@@ -639,9 +638,20 @@
               <w:spacing w:before="60" w:after="100"/>
               <w:rPr>
                 <w:rFonts w:ascii="Garamond" w:hAnsi="Garamond"/>
-                <w:color w:val="000000" w:themeColor="text1"/>
-              </w:rPr>
-            </w:pPr>
+                <w:b/>
+                <w:bCs/>
+                <w:color w:val="FF0000"/>
+              </w:rPr>
+            </w:pPr>
+            <w:r>
+              <w:rPr>
+                <w:rFonts w:ascii="Garamond" w:hAnsi="Garamond"/>
+                <w:b/>
+                <w:bCs/>
+                <w:color w:val="FF0000"/>
+              </w:rPr>
+              <w:t>The assigned study condition: re-reading (A), active recall (B), or AI-Assisted(C)</w:t>
+            </w:r>
           </w:p>
         </w:tc>
       </w:tr>
@@ -655,7 +665,9 @@
               <w:spacing w:before="60" w:after="100"/>
               <w:rPr>
                 <w:rFonts w:ascii="Garamond" w:hAnsi="Garamond"/>
-                <w:color w:val="000000" w:themeColor="text1"/>
+                <w:b/>
+                <w:bCs/>
+                <w:color w:val="FF0000"/>
                 <w:u w:val="single"/>
               </w:rPr>
             </w:pPr>
@@ -665,10 +677,22 @@
               <w:spacing w:before="60" w:after="100"/>
               <w:rPr>
                 <w:rFonts w:ascii="Garamond" w:hAnsi="Garamond"/>
-                <w:color w:val="000000" w:themeColor="text1"/>
+                <w:b/>
+                <w:bCs/>
+                <w:color w:val="FF0000"/>
                 <w:u w:val="single"/>
               </w:rPr>
             </w:pPr>
+            <w:r>
+              <w:rPr>
+                <w:rFonts w:ascii="Garamond" w:hAnsi="Garamond"/>
+                <w:b/>
+                <w:bCs/>
+                <w:color w:val="FF0000"/>
+                <w:u w:val="single"/>
+              </w:rPr>
+              <w:t>Exam Score</w:t>
+            </w:r>
           </w:p>
         </w:tc>
         <w:tc>
@@ -680,9 +704,20 @@
               <w:spacing w:before="60" w:after="100"/>
               <w:rPr>
                 <w:rFonts w:ascii="Garamond" w:hAnsi="Garamond"/>
-                <w:color w:val="000000" w:themeColor="text1"/>
-              </w:rPr>
-            </w:pPr>
+                <w:b/>
+                <w:bCs/>
+                <w:color w:val="FF0000"/>
+              </w:rPr>
+            </w:pPr>
+            <w:r>
+              <w:rPr>
+                <w:rFonts w:ascii="Garamond" w:hAnsi="Garamond"/>
+                <w:b/>
+                <w:bCs/>
+                <w:color w:val="FF0000"/>
+              </w:rPr>
+              <w:t xml:space="preserve">Score on the unit exam, measured 0-100 points </w:t>
+            </w:r>
           </w:p>
         </w:tc>
       </w:tr>
@@ -796,9 +831,32 @@
               <w:spacing w:before="60" w:after="100"/>
               <w:rPr>
                 <w:rFonts w:ascii="Garamond" w:hAnsi="Garamond"/>
-                <w:color w:val="000000" w:themeColor="text1"/>
-              </w:rPr>
-            </w:pPr>
+                <w:b/>
+                <w:bCs/>
+                <w:color w:val="FF0000"/>
+                <w:u w:val="single"/>
+              </w:rPr>
+            </w:pPr>
+            <w:r>
+              <w:rPr>
+                <w:rFonts w:ascii="Garamond" w:hAnsi="Garamond"/>
+                <w:b/>
+                <w:bCs/>
+                <w:color w:val="FF0000"/>
+                <w:u w:val="single"/>
+              </w:rPr>
+              <w:t>Study Method</w:t>
+            </w:r>
+            <w:r>
+              <w:rPr>
+                <w:rFonts w:ascii="Garamond" w:hAnsi="Garamond"/>
+                <w:b/>
+                <w:bCs/>
+                <w:color w:val="FF0000"/>
+                <w:u w:val="single"/>
+              </w:rPr>
+              <w:t xml:space="preserve"> (A, B, C)</w:t>
+            </w:r>
           </w:p>
           <w:p>
             <w:pPr>
@@ -844,28 +902,64 @@
               <w:spacing w:before="60" w:after="100"/>
               <w:rPr>
                 <w:rFonts w:ascii="Garamond" w:hAnsi="Garamond"/>
-                <w:color w:val="000000" w:themeColor="text1"/>
-                <w:u w:val="single"/>
-              </w:rPr>
-            </w:pPr>
-          </w:p>
-          <w:p>
-            <w:pPr>
-              <w:spacing w:before="60" w:after="100"/>
-              <w:rPr>
-                <w:rFonts w:ascii="Garamond" w:hAnsi="Garamond"/>
-                <w:color w:val="000000" w:themeColor="text1"/>
-              </w:rPr>
-            </w:pPr>
+                <w:b/>
+                <w:bCs/>
+                <w:color w:val="000000" w:themeColor="text1"/>
+              </w:rPr>
+            </w:pPr>
+            <w:r>
+              <w:rPr>
+                <w:rFonts w:ascii="Garamond" w:hAnsi="Garamond"/>
+                <w:b/>
+                <w:bCs/>
+                <w:color w:val="FF0000"/>
+              </w:rPr>
+              <w:t>Exam Score</w:t>
+            </w:r>
           </w:p>
         </w:tc>
       </w:tr>
     </w:tbl>
     <w:p>
       <w:pPr>
-        <w:spacing w:before="240" w:after="240"/>
-        <w:rPr>
-          <w:rFonts w:ascii="Garamond" w:hAnsi="Garamond"/>
+        <w:spacing w:before="160" w:after="80"/>
+        <w:rPr>
+          <w:rFonts w:ascii="Garamond" w:hAnsi="Garamond"/>
+          <w:b/>
+          <w:bCs/>
+          <w:color w:val="000000" w:themeColor="text1"/>
+        </w:rPr>
+      </w:pPr>
+    </w:p>
+    <w:p>
+      <w:pPr>
+        <w:spacing w:before="160" w:after="80"/>
+        <w:rPr>
+          <w:rFonts w:ascii="Garamond" w:hAnsi="Garamond"/>
+          <w:b/>
+          <w:bCs/>
+          <w:color w:val="000000" w:themeColor="text1"/>
+        </w:rPr>
+      </w:pPr>
+    </w:p>
+    <w:p>
+      <w:pPr>
+        <w:spacing w:before="160" w:after="80"/>
+        <w:rPr>
+          <w:rFonts w:ascii="Garamond" w:hAnsi="Garamond"/>
+          <w:b/>
+          <w:bCs/>
+          <w:color w:val="000000" w:themeColor="text1"/>
+        </w:rPr>
+      </w:pPr>
+    </w:p>
+    <w:p>
+      <w:pPr>
+        <w:spacing w:before="160" w:after="80"/>
+        <w:rPr>
+          <w:rFonts w:ascii="Garamond" w:hAnsi="Garamond"/>
+          <w:b/>
+          <w:bCs/>
           <w:color w:val="000000" w:themeColor="text1"/>
         </w:rPr>
       </w:pPr>
@@ -910,15 +1004,15 @@
               <w:spacing w:before="60" w:after="100"/>
               <w:rPr>
                 <w:rFonts w:ascii="Garamond" w:hAnsi="Garamond"/>
-                <w:color w:val="000000" w:themeColor="text1"/>
-              </w:rPr>
-            </w:pPr>
-            <w:r>
-              <w:rPr>
-                <w:rFonts w:ascii="Garamond" w:hAnsi="Garamond"/>
-                <w:b/>
-                <w:bCs/>
-                <w:color w:val="000000" w:themeColor="text1"/>
+                <w:color w:val="FF0000"/>
+              </w:rPr>
+            </w:pPr>
+            <w:r>
+              <w:rPr>
+                <w:rFonts w:ascii="Garamond" w:hAnsi="Garamond"/>
+                <w:b/>
+                <w:bCs/>
+                <w:color w:val="FF0000"/>
               </w:rPr>
               <w:t>Variable</w:t>
             </w:r>
@@ -933,15 +1027,15 @@
               <w:spacing w:before="60" w:after="100"/>
               <w:rPr>
                 <w:rFonts w:ascii="Garamond" w:hAnsi="Garamond"/>
-                <w:color w:val="000000" w:themeColor="text1"/>
-              </w:rPr>
-            </w:pPr>
-            <w:r>
-              <w:rPr>
-                <w:rFonts w:ascii="Garamond" w:hAnsi="Garamond"/>
-                <w:b/>
-                <w:bCs/>
-                <w:color w:val="000000" w:themeColor="text1"/>
+                <w:color w:val="FF0000"/>
+              </w:rPr>
+            </w:pPr>
+            <w:r>
+              <w:rPr>
+                <w:rFonts w:ascii="Garamond" w:hAnsi="Garamond"/>
+                <w:b/>
+                <w:bCs/>
+                <w:color w:val="FF0000"/>
               </w:rPr>
               <w:t>Type</w:t>
             </w:r>
@@ -956,15 +1050,15 @@
               <w:spacing w:before="60" w:after="100"/>
               <w:rPr>
                 <w:rFonts w:ascii="Garamond" w:hAnsi="Garamond"/>
-                <w:color w:val="000000" w:themeColor="text1"/>
-              </w:rPr>
-            </w:pPr>
-            <w:r>
-              <w:rPr>
-                <w:rFonts w:ascii="Garamond" w:hAnsi="Garamond"/>
-                <w:b/>
-                <w:bCs/>
-                <w:color w:val="000000" w:themeColor="text1"/>
+                <w:color w:val="FF0000"/>
+              </w:rPr>
+            </w:pPr>
+            <w:r>
+              <w:rPr>
+                <w:rFonts w:ascii="Garamond" w:hAnsi="Garamond"/>
+                <w:b/>
+                <w:bCs/>
+                <w:color w:val="FF0000"/>
               </w:rPr>
               <w:t>How many categories / units?</w:t>
             </w:r>
@@ -980,17 +1074,24 @@
             <w:pPr>
               <w:rPr>
                 <w:rFonts w:ascii="Garamond" w:hAnsi="Garamond"/>
-                <w:color w:val="000000" w:themeColor="text1"/>
-              </w:rPr>
-            </w:pPr>
-          </w:p>
-          <w:p>
-            <w:pPr>
-              <w:rPr>
-                <w:rFonts w:ascii="Garamond" w:hAnsi="Garamond"/>
-                <w:color w:val="000000" w:themeColor="text1"/>
-              </w:rPr>
-            </w:pPr>
+                <w:color w:val="FF0000"/>
+              </w:rPr>
+            </w:pPr>
+          </w:p>
+          <w:p>
+            <w:pPr>
+              <w:rPr>
+                <w:rFonts w:ascii="Garamond" w:hAnsi="Garamond"/>
+                <w:color w:val="FF0000"/>
+              </w:rPr>
+            </w:pPr>
+            <w:r>
+              <w:rPr>
+                <w:rFonts w:ascii="Garamond" w:hAnsi="Garamond"/>
+                <w:color w:val="FF0000"/>
+              </w:rPr>
+              <w:t>Study Method</w:t>
+            </w:r>
           </w:p>
         </w:tc>
         <w:tc>
@@ -1002,16 +1103,23 @@
               <w:spacing w:before="60" w:after="100"/>
               <w:rPr>
                 <w:rFonts w:ascii="Garamond" w:hAnsi="Garamond"/>
-                <w:color w:val="000000" w:themeColor="text1"/>
-              </w:rPr>
-            </w:pPr>
+                <w:color w:val="FF0000"/>
+              </w:rPr>
+            </w:pPr>
+            <w:r>
+              <w:rPr>
+                <w:rFonts w:ascii="Garamond" w:hAnsi="Garamond"/>
+                <w:color w:val="FF0000"/>
+              </w:rPr>
+              <w:t>Categorical</w:t>
+            </w:r>
           </w:p>
           <w:p>
             <w:pPr>
               <w:spacing w:before="60" w:after="100"/>
               <w:rPr>
                 <w:rFonts w:ascii="Garamond" w:hAnsi="Garamond"/>
-                <w:color w:val="000000" w:themeColor="text1"/>
+                <w:color w:val="FF0000"/>
               </w:rPr>
             </w:pPr>
           </w:p>
@@ -1025,9 +1133,16 @@
               <w:spacing w:before="60" w:after="100"/>
               <w:rPr>
                 <w:rFonts w:ascii="Garamond" w:hAnsi="Garamond"/>
-                <w:color w:val="000000" w:themeColor="text1"/>
-              </w:rPr>
-            </w:pPr>
+                <w:color w:val="FF0000"/>
+              </w:rPr>
+            </w:pPr>
+            <w:r>
+              <w:rPr>
+                <w:rFonts w:ascii="Garamond" w:hAnsi="Garamond"/>
+                <w:color w:val="FF0000"/>
+              </w:rPr>
+              <w:t>3 levels: A, B, C</w:t>
+            </w:r>
           </w:p>
         </w:tc>
       </w:tr>
@@ -1040,23 +1155,30 @@
             <w:pPr>
               <w:rPr>
                 <w:rFonts w:ascii="Garamond" w:hAnsi="Garamond"/>
-                <w:color w:val="000000" w:themeColor="text1"/>
-              </w:rPr>
-            </w:pPr>
-          </w:p>
-          <w:p>
-            <w:pPr>
-              <w:rPr>
-                <w:rFonts w:ascii="Garamond" w:hAnsi="Garamond"/>
-                <w:color w:val="000000" w:themeColor="text1"/>
-              </w:rPr>
-            </w:pPr>
-          </w:p>
-          <w:p>
-            <w:pPr>
-              <w:rPr>
-                <w:rFonts w:ascii="Garamond" w:hAnsi="Garamond"/>
-                <w:color w:val="000000" w:themeColor="text1"/>
+                <w:color w:val="FF0000"/>
+              </w:rPr>
+            </w:pPr>
+          </w:p>
+          <w:p>
+            <w:pPr>
+              <w:rPr>
+                <w:rFonts w:ascii="Garamond" w:hAnsi="Garamond"/>
+                <w:color w:val="FF0000"/>
+              </w:rPr>
+            </w:pPr>
+            <w:r>
+              <w:rPr>
+                <w:rFonts w:ascii="Garamond" w:hAnsi="Garamond"/>
+                <w:color w:val="FF0000"/>
+              </w:rPr>
+              <w:t xml:space="preserve">Exam Score </w:t>
+            </w:r>
+          </w:p>
+          <w:p>
+            <w:pPr>
+              <w:rPr>
+                <w:rFonts w:ascii="Garamond" w:hAnsi="Garamond"/>
+                <w:color w:val="FF0000"/>
               </w:rPr>
             </w:pPr>
           </w:p>
@@ -1070,9 +1192,16 @@
               <w:spacing w:before="60" w:after="100"/>
               <w:rPr>
                 <w:rFonts w:ascii="Garamond" w:hAnsi="Garamond"/>
-                <w:color w:val="000000" w:themeColor="text1"/>
-              </w:rPr>
-            </w:pPr>
+                <w:color w:val="FF0000"/>
+              </w:rPr>
+            </w:pPr>
+            <w:r>
+              <w:rPr>
+                <w:rFonts w:ascii="Garamond" w:hAnsi="Garamond"/>
+                <w:color w:val="FF0000"/>
+              </w:rPr>
+              <w:t>Quantitative</w:t>
+            </w:r>
           </w:p>
         </w:tc>
         <w:tc>
@@ -1084,9 +1213,16 @@
               <w:spacing w:before="60" w:after="100"/>
               <w:rPr>
                 <w:rFonts w:ascii="Garamond" w:hAnsi="Garamond"/>
-                <w:color w:val="000000" w:themeColor="text1"/>
-              </w:rPr>
-            </w:pPr>
+                <w:color w:val="FF0000"/>
+              </w:rPr>
+            </w:pPr>
+            <w:r>
+              <w:rPr>
+                <w:rFonts w:ascii="Garamond" w:hAnsi="Garamond"/>
+                <w:color w:val="FF0000"/>
+              </w:rPr>
+              <w:t>Points: (0-100)</w:t>
+            </w:r>
           </w:p>
         </w:tc>
       </w:tr>
@@ -1236,136 +1372,202 @@
       <w:pPr>
         <w:spacing w:before="160" w:after="160"/>
         <w:rPr>
-          <w:rFonts w:ascii="Garamond" w:hAnsi="Garamond"/>
-          <w:color w:val="000000" w:themeColor="text1"/>
-        </w:rPr>
-      </w:pPr>
+          <w:rFonts w:ascii="Garamond" w:eastAsia="Courier New" w:hAnsi="Garamond" w:cs="Courier New"/>
+          <w:b/>
+          <w:bCs/>
+          <w:color w:val="FF0000"/>
+          <w:sz w:val="20"/>
+          <w:szCs w:val="20"/>
+        </w:rPr>
+      </w:pPr>
+      <w:proofErr w:type="spellStart"/>
+      <w:r>
+        <w:rPr>
+          <w:rFonts w:ascii="Garamond" w:eastAsia="Courier New" w:hAnsi="Garamond" w:cs="Courier New"/>
+          <w:b/>
+          <w:bCs/>
+          <w:color w:val="FF0000"/>
+          <w:sz w:val="20"/>
+          <w:szCs w:val="20"/>
+        </w:rPr>
+        <w:t>μ_A</w:t>
+      </w:r>
+      <w:proofErr w:type="spellEnd"/>
+      <w:proofErr w:type="gramStart"/>
+      <w:r>
+        <w:rPr>
+          <w:rFonts w:ascii="Garamond" w:hAnsi="Garamond"/>
+          <w:b/>
+          <w:bCs/>
+          <w:color w:val="FF0000"/>
+        </w:rPr>
+        <w:t xml:space="preserve">= </w:t>
+      </w:r>
+      <w:r>
+        <w:rPr>
+          <w:rFonts w:ascii="Garamond" w:hAnsi="Garamond"/>
+          <w:b/>
+          <w:bCs/>
+          <w:color w:val="FF0000"/>
+        </w:rPr>
+        <w:t xml:space="preserve"> </w:t>
+      </w:r>
+      <w:proofErr w:type="spellStart"/>
+      <w:r>
+        <w:rPr>
+          <w:rFonts w:ascii="Garamond" w:eastAsia="Courier New" w:hAnsi="Garamond" w:cs="Courier New"/>
+          <w:b/>
+          <w:bCs/>
+          <w:color w:val="FF0000"/>
+          <w:sz w:val="20"/>
+          <w:szCs w:val="20"/>
+        </w:rPr>
+        <w:t>μ</w:t>
+      </w:r>
+      <w:proofErr w:type="gramEnd"/>
+      <w:r>
+        <w:rPr>
+          <w:rFonts w:ascii="Garamond" w:eastAsia="Courier New" w:hAnsi="Garamond" w:cs="Courier New"/>
+          <w:b/>
+          <w:bCs/>
+          <w:color w:val="FF0000"/>
+          <w:sz w:val="20"/>
+          <w:szCs w:val="20"/>
+        </w:rPr>
+        <w:t>_B</w:t>
+      </w:r>
+      <w:proofErr w:type="spellEnd"/>
+      <w:r>
+        <w:rPr>
+          <w:rFonts w:ascii="Garamond" w:hAnsi="Garamond"/>
+          <w:b/>
+          <w:bCs/>
+          <w:color w:val="FF0000"/>
+        </w:rPr>
+        <w:t xml:space="preserve"> </w:t>
+      </w:r>
+      <w:proofErr w:type="gramStart"/>
+      <w:r>
+        <w:rPr>
+          <w:rFonts w:ascii="Garamond" w:hAnsi="Garamond"/>
+          <w:b/>
+          <w:bCs/>
+          <w:color w:val="FF0000"/>
+        </w:rPr>
+        <w:t xml:space="preserve">= </w:t>
+      </w:r>
+      <w:r>
+        <w:rPr>
+          <w:rFonts w:ascii="Garamond" w:hAnsi="Garamond"/>
+          <w:b/>
+          <w:bCs/>
+          <w:color w:val="FF0000"/>
+        </w:rPr>
+        <w:t xml:space="preserve"> </w:t>
+      </w:r>
+      <w:proofErr w:type="spellStart"/>
+      <w:r>
+        <w:rPr>
+          <w:rFonts w:ascii="Garamond" w:eastAsia="Courier New" w:hAnsi="Garamond" w:cs="Courier New"/>
+          <w:b/>
+          <w:bCs/>
+          <w:color w:val="FF0000"/>
+          <w:sz w:val="20"/>
+          <w:szCs w:val="20"/>
+        </w:rPr>
+        <w:t>μ</w:t>
+      </w:r>
+      <w:proofErr w:type="gramEnd"/>
+      <w:r>
+        <w:rPr>
+          <w:rFonts w:ascii="Garamond" w:eastAsia="Courier New" w:hAnsi="Garamond" w:cs="Courier New"/>
+          <w:b/>
+          <w:bCs/>
+          <w:color w:val="FF0000"/>
+          <w:sz w:val="20"/>
+          <w:szCs w:val="20"/>
+        </w:rPr>
+        <w:t>_C</w:t>
+      </w:r>
+      <w:proofErr w:type="spellEnd"/>
     </w:p>
     <w:p>
       <w:pPr>
         <w:spacing w:before="160" w:after="160"/>
         <w:rPr>
           <w:rFonts w:ascii="Garamond" w:hAnsi="Garamond"/>
-          <w:color w:val="000000" w:themeColor="text1"/>
-        </w:rPr>
-      </w:pPr>
+          <w:b/>
+          <w:bCs/>
+          <w:color w:val="FF0000"/>
+        </w:rPr>
+      </w:pPr>
+      <w:r>
+        <w:rPr>
+          <w:rFonts w:ascii="Garamond" w:eastAsia="Courier New" w:hAnsi="Garamond" w:cs="Courier New"/>
+          <w:b/>
+          <w:bCs/>
+          <w:color w:val="FF0000"/>
+          <w:sz w:val="20"/>
+          <w:szCs w:val="20"/>
+        </w:rPr>
+        <w:t>The population mean of exam scores are the same regardless of study method (A, B, C)</w:t>
+      </w:r>
+    </w:p>
+    <w:p>
+      <w:pPr>
+        <w:spacing w:before="160" w:after="80"/>
+        <w:rPr>
+          <w:rFonts w:ascii="Garamond" w:hAnsi="Garamond"/>
+          <w:color w:val="000000" w:themeColor="text1"/>
+        </w:rPr>
+      </w:pPr>
+      <w:r>
+        <w:rPr>
+          <w:rFonts w:ascii="Garamond" w:hAnsi="Garamond"/>
+          <w:b/>
+          <w:bCs/>
+          <w:color w:val="000000" w:themeColor="text1"/>
+        </w:rPr>
+        <w:t>Alternative Hypothesis (H</w:t>
+      </w:r>
+      <w:r>
+        <w:rPr>
+          <w:rFonts w:ascii="Cambria Math" w:hAnsi="Cambria Math" w:cs="Cambria Math"/>
+          <w:b/>
+          <w:bCs/>
+          <w:color w:val="000000" w:themeColor="text1"/>
+        </w:rPr>
+        <w:t>ₐ</w:t>
+      </w:r>
+      <w:r>
+        <w:rPr>
+          <w:rFonts w:ascii="Garamond" w:hAnsi="Garamond"/>
+          <w:b/>
+          <w:bCs/>
+          <w:color w:val="000000" w:themeColor="text1"/>
+        </w:rPr>
+        <w:t>)</w:t>
+      </w:r>
     </w:p>
     <w:p>
       <w:pPr>
         <w:spacing w:before="160" w:after="160"/>
         <w:rPr>
           <w:rFonts w:ascii="Garamond" w:hAnsi="Garamond"/>
-          <w:color w:val="000000" w:themeColor="text1"/>
-        </w:rPr>
-      </w:pPr>
-    </w:p>
-    <w:p>
-      <w:pPr>
-        <w:spacing w:before="160" w:after="160"/>
-        <w:rPr>
-          <w:rFonts w:ascii="Garamond" w:hAnsi="Garamond"/>
-          <w:color w:val="000000" w:themeColor="text1"/>
-        </w:rPr>
-      </w:pPr>
-    </w:p>
-    <w:p>
-      <w:pPr>
-        <w:spacing w:before="160" w:after="160"/>
-        <w:rPr>
-          <w:rFonts w:ascii="Garamond" w:hAnsi="Garamond"/>
-          <w:color w:val="000000" w:themeColor="text1"/>
-        </w:rPr>
-      </w:pPr>
-    </w:p>
-    <w:p>
-      <w:pPr>
-        <w:spacing w:before="160" w:after="160"/>
-        <w:rPr>
-          <w:rFonts w:ascii="Garamond" w:hAnsi="Garamond"/>
-          <w:color w:val="000000" w:themeColor="text1"/>
-        </w:rPr>
-      </w:pPr>
-    </w:p>
-    <w:p>
-      <w:pPr>
-        <w:spacing w:before="160" w:after="160"/>
-        <w:rPr>
-          <w:rFonts w:ascii="Garamond" w:hAnsi="Garamond"/>
-          <w:color w:val="000000" w:themeColor="text1"/>
-        </w:rPr>
-      </w:pPr>
-    </w:p>
-    <w:p>
-      <w:pPr>
-        <w:spacing w:before="160" w:after="80"/>
-        <w:rPr>
-          <w:rFonts w:ascii="Garamond" w:hAnsi="Garamond"/>
-          <w:color w:val="000000" w:themeColor="text1"/>
-        </w:rPr>
-      </w:pPr>
-      <w:r>
-        <w:rPr>
-          <w:rFonts w:ascii="Garamond" w:hAnsi="Garamond"/>
-          <w:b/>
-          <w:bCs/>
-          <w:color w:val="000000" w:themeColor="text1"/>
-        </w:rPr>
-        <w:t>Alternative Hypothesis (H</w:t>
-      </w:r>
-      <w:r>
-        <w:rPr>
-          <w:rFonts w:ascii="Cambria Math" w:hAnsi="Cambria Math" w:cs="Cambria Math"/>
-          <w:b/>
-          <w:bCs/>
-          <w:color w:val="000000" w:themeColor="text1"/>
-        </w:rPr>
-        <w:t>ₐ</w:t>
-      </w:r>
-      <w:r>
-        <w:rPr>
-          <w:rFonts w:ascii="Garamond" w:hAnsi="Garamond"/>
-          <w:b/>
-          <w:bCs/>
-          <w:color w:val="000000" w:themeColor="text1"/>
-        </w:rPr>
-        <w:t>)</w:t>
-      </w:r>
-    </w:p>
-    <w:p>
-      <w:pPr>
-        <w:spacing w:before="160" w:after="160"/>
-        <w:rPr>
-          <w:rFonts w:ascii="Garamond" w:hAnsi="Garamond"/>
-          <w:color w:val="000000" w:themeColor="text1"/>
-        </w:rPr>
-      </w:pPr>
-    </w:p>
-    <w:p>
-      <w:pPr>
-        <w:spacing w:before="160" w:after="160"/>
-        <w:rPr>
-          <w:rFonts w:ascii="Garamond" w:hAnsi="Garamond"/>
-          <w:color w:val="000000" w:themeColor="text1"/>
-        </w:rPr>
-      </w:pPr>
-    </w:p>
-    <w:p>
-      <w:pPr>
-        <w:spacing w:before="160" w:after="160"/>
-        <w:rPr>
-          <w:rFonts w:ascii="Garamond" w:hAnsi="Garamond"/>
-          <w:color w:val="000000" w:themeColor="text1"/>
-        </w:rPr>
-      </w:pPr>
-    </w:p>
-    <w:p>
-      <w:pPr>
-        <w:spacing w:before="160" w:after="160"/>
-        <w:rPr>
-          <w:rFonts w:ascii="Garamond" w:hAnsi="Garamond"/>
-          <w:color w:val="000000" w:themeColor="text1"/>
-        </w:rPr>
-      </w:pPr>
+          <w:b/>
+          <w:bCs/>
+          <w:color w:val="FF0000"/>
+        </w:rPr>
+      </w:pPr>
+      <w:r>
+        <w:rPr>
+          <w:rFonts w:ascii="Garamond" w:hAnsi="Garamond"/>
+          <w:b/>
+          <w:bCs/>
+          <w:color w:val="FF0000"/>
+        </w:rPr>
+        <w:t>At least one of the population means of exam scores differ from the other population means of exam scores in terms of study methods</w:t>
+      </w:r>
     </w:p>
     <w:p>
       <w:pPr>
@@ -1561,6 +1763,9 @@
         <w:gridCol w:w="1200"/>
       </w:tblGrid>
       <w:tr>
+        <w:trPr>
+          <w:trHeight w:val="341"/>
+        </w:trPr>
         <w:tc>
           <w:tcPr>
             <w:tcW w:w="2400" w:type="dxa"/>
@@ -1686,20 +1891,6 @@
               </w:rPr>
               <w:t>F</w:t>
             </w:r>
-          </w:p>
-        </w:tc>
-        <w:tc>
-          <w:tcPr>
-            <w:tcW w:w="1200" w:type="dxa"/>
-          </w:tcPr>
-          <w:p>
-            <w:pPr>
-              <w:spacing w:before="40" w:after="40"/>
-              <w:rPr>
-                <w:rFonts w:ascii="Garamond" w:hAnsi="Garamond"/>
-                <w:color w:val="000000" w:themeColor="text1"/>
-              </w:rPr>
-            </w:pPr>
             <w:r>
               <w:rPr>
                 <w:rFonts w:ascii="Garamond" w:hAnsi="Garamond"/>
@@ -1709,6 +1900,31 @@
                 <w:sz w:val="20"/>
                 <w:szCs w:val="20"/>
               </w:rPr>
+              <w:t xml:space="preserve"> (TS)</w:t>
+            </w:r>
+          </w:p>
+        </w:tc>
+        <w:tc>
+          <w:tcPr>
+            <w:tcW w:w="1200" w:type="dxa"/>
+          </w:tcPr>
+          <w:p>
+            <w:pPr>
+              <w:spacing w:before="40" w:after="40"/>
+              <w:rPr>
+                <w:rFonts w:ascii="Garamond" w:hAnsi="Garamond"/>
+                <w:color w:val="000000" w:themeColor="text1"/>
+              </w:rPr>
+            </w:pPr>
+            <w:r>
+              <w:rPr>
+                <w:rFonts w:ascii="Garamond" w:hAnsi="Garamond"/>
+                <w:b/>
+                <w:bCs/>
+                <w:color w:val="000000" w:themeColor="text1"/>
+                <w:sz w:val="20"/>
+                <w:szCs w:val="20"/>
+              </w:rPr>
               <w:t>p-value</w:t>
             </w:r>
           </w:p>
@@ -2163,43 +2379,55 @@
         <w:spacing w:before="80" w:after="120"/>
         <w:rPr>
           <w:rFonts w:ascii="Garamond" w:hAnsi="Garamond"/>
-          <w:color w:val="000000" w:themeColor="text1"/>
-        </w:rPr>
-      </w:pPr>
-      <w:r>
-        <w:rPr>
-          <w:rFonts w:ascii="Garamond" w:hAnsi="Garamond"/>
-          <w:color w:val="000000" w:themeColor="text1"/>
+          <w:b/>
+          <w:bCs/>
+          <w:color w:val="FF0000"/>
+        </w:rPr>
+      </w:pPr>
+      <w:r>
+        <w:rPr>
+          <w:rFonts w:ascii="Garamond" w:hAnsi="Garamond"/>
+          <w:b/>
+          <w:bCs/>
+          <w:color w:val="FF0000"/>
         </w:rPr>
         <w:t xml:space="preserve">F = </w:t>
       </w:r>
       <w:r>
         <w:rPr>
           <w:rFonts w:ascii="Garamond" w:hAnsi="Garamond"/>
-          <w:color w:val="000000" w:themeColor="text1"/>
+          <w:b/>
+          <w:bCs/>
+          <w:color w:val="FF0000"/>
           <w:u w:val="single"/>
         </w:rPr>
-        <w:t>          </w:t>
-      </w:r>
-      <w:r>
-        <w:rPr>
-          <w:rFonts w:ascii="Garamond" w:hAnsi="Garamond"/>
-          <w:color w:val="000000" w:themeColor="text1"/>
+        <w:t>9.14</w:t>
+      </w:r>
+      <w:r>
+        <w:rPr>
+          <w:rFonts w:ascii="Garamond" w:hAnsi="Garamond"/>
+          <w:b/>
+          <w:bCs/>
+          <w:color w:val="FF0000"/>
         </w:rPr>
         <w:t xml:space="preserve">     This means between-group variability is approximately </w:t>
       </w:r>
       <w:r>
         <w:rPr>
           <w:rFonts w:ascii="Garamond" w:hAnsi="Garamond"/>
-          <w:color w:val="000000" w:themeColor="text1"/>
+          <w:b/>
+          <w:bCs/>
+          <w:color w:val="FF0000"/>
           <w:u w:val="single"/>
         </w:rPr>
-        <w:t>          </w:t>
-      </w:r>
-      <w:r>
-        <w:rPr>
-          <w:rFonts w:ascii="Garamond" w:hAnsi="Garamond"/>
-          <w:color w:val="000000" w:themeColor="text1"/>
+        <w:t>9.14</w:t>
+      </w:r>
+      <w:r>
+        <w:rPr>
+          <w:rFonts w:ascii="Garamond" w:hAnsi="Garamond"/>
+          <w:b/>
+          <w:bCs/>
+          <w:color w:val="FF0000"/>
         </w:rPr>
         <w:t xml:space="preserve"> larger than within-group variability.</w:t>
       </w:r>
@@ -2236,23 +2464,29 @@
         <w:spacing w:before="80" w:after="120"/>
         <w:rPr>
           <w:rFonts w:ascii="Garamond" w:hAnsi="Garamond"/>
-          <w:color w:val="000000" w:themeColor="text1"/>
-        </w:rPr>
-      </w:pPr>
-      <w:r>
-        <w:rPr>
-          <w:rFonts w:ascii="Garamond" w:hAnsi="Garamond"/>
-          <w:color w:val="000000" w:themeColor="text1"/>
+          <w:b/>
+          <w:bCs/>
+          <w:color w:val="FF0000"/>
+        </w:rPr>
+      </w:pPr>
+      <w:r>
+        <w:rPr>
+          <w:rFonts w:ascii="Garamond" w:hAnsi="Garamond"/>
+          <w:b/>
+          <w:bCs/>
+          <w:color w:val="FF0000"/>
         </w:rPr>
         <w:t xml:space="preserve">p-value = </w:t>
       </w:r>
       <w:r>
         <w:rPr>
           <w:rFonts w:ascii="Garamond" w:hAnsi="Garamond"/>
-          <w:color w:val="000000" w:themeColor="text1"/>
+          <w:b/>
+          <w:bCs/>
+          <w:color w:val="FF0000"/>
           <w:u w:val="single"/>
         </w:rPr>
-        <w:t>          </w:t>
+        <w:t>0.003</w:t>
       </w:r>
     </w:p>
     <w:p>
@@ -2260,9 +2494,20 @@
         <w:spacing w:before="200" w:after="200"/>
         <w:rPr>
           <w:rFonts w:ascii="Garamond" w:hAnsi="Garamond"/>
-          <w:color w:val="000000" w:themeColor="text1"/>
-        </w:rPr>
-      </w:pPr>
+          <w:b/>
+          <w:bCs/>
+          <w:color w:val="FF0000"/>
+        </w:rPr>
+      </w:pPr>
+      <w:r>
+        <w:rPr>
+          <w:rFonts w:ascii="Garamond" w:hAnsi="Garamond"/>
+          <w:b/>
+          <w:bCs/>
+          <w:color w:val="FF0000"/>
+        </w:rPr>
+        <w:t xml:space="preserve">The probability of rejecting the null hypothesis when the null hypothesis is true. </w:t>
+      </w:r>
     </w:p>
     <w:p>
       <w:pPr>
@@ -2275,15 +2520,6 @@
     </w:p>
     <w:p>
       <w:pPr>
-        <w:spacing w:before="200" w:after="200"/>
-        <w:rPr>
-          <w:rFonts w:ascii="Garamond" w:hAnsi="Garamond"/>
-          <w:color w:val="000000" w:themeColor="text1"/>
-        </w:rPr>
-      </w:pPr>
-    </w:p>
-    <w:p>
-      <w:pPr>
         <w:spacing w:before="160" w:after="80"/>
         <w:rPr>
           <w:rFonts w:ascii="Garamond" w:hAnsi="Garamond"/>
@@ -2322,6 +2558,55 @@
           <w:color w:val="000000" w:themeColor="text1"/>
         </w:rPr>
       </w:pPr>
+    </w:p>
+    <w:p>
+      <w:pPr>
+        <w:spacing w:before="120" w:after="120"/>
+        <w:rPr>
+          <w:rFonts w:ascii="Garamond" w:hAnsi="Garamond"/>
+          <w:b/>
+          <w:bCs/>
+          <w:color w:val="FF0000"/>
+        </w:rPr>
+      </w:pPr>
+      <w:r>
+        <w:rPr>
+          <w:rFonts w:ascii="Garamond" w:hAnsi="Garamond"/>
+          <w:b/>
+          <w:bCs/>
+          <w:color w:val="FF0000"/>
+        </w:rPr>
+        <w:t>Based on our data we have strong evidence to reject the null hypothesis which implies that population means of exam scores regarding the study methods are the same. With a p-value = 0.003 &lt; 0.1.</w:t>
+      </w:r>
+      <w:r>
+        <w:rPr>
+          <w:rFonts w:ascii="Garamond" w:hAnsi="Garamond"/>
+          <w:b/>
+          <w:bCs/>
+          <w:color w:val="FF0000"/>
+        </w:rPr>
+        <w:t xml:space="preserve"> Based on these results we should implement a </w:t>
+      </w:r>
+      <w:proofErr w:type="gramStart"/>
+      <w:r>
+        <w:rPr>
+          <w:rFonts w:ascii="Garamond" w:hAnsi="Garamond"/>
+          <w:b/>
+          <w:bCs/>
+          <w:color w:val="FF0000"/>
+        </w:rPr>
+        <w:t>Post-Hoc</w:t>
+      </w:r>
+      <w:proofErr w:type="gramEnd"/>
+      <w:r>
+        <w:rPr>
+          <w:rFonts w:ascii="Garamond" w:hAnsi="Garamond"/>
+          <w:b/>
+          <w:bCs/>
+          <w:color w:val="FF0000"/>
+        </w:rPr>
+        <w:t xml:space="preserve"> method to determine which means are different from one another. </w:t>
+      </w:r>
     </w:p>
     <w:sectPr>
       <w:headerReference w:type="default" r:id="rId7"/>

</xml_diff>